<commit_message>
Feedback round batch 1: deck (subject tools, bigger headers, product intros), lesson plan objectives and DOK level, Jamaican context for AI, Current and future, library genres
Co-Authored-By: Claude Sonnet 5.5 <noreply@anthropic.com>
</commit_message>
<xml_diff>
--- a/marketing/presentation/guides/word/01-Kevin-Palmer.docx
+++ b/marketing/presentation/guides/word/01-Kevin-Palmer.docx
@@ -1715,7 +1715,7 @@
                 <w:sz w:val="24"/>
                 <w:szCs w:val="24"/>
               </w:rPr>
-              <w:t xml:space="preserve">Multiple choice, true/false, short answer, fill in the blank and essay, with images, audio and a maths toolbar. Save questions in a bank and reuse them. Turn a PDF into questions, or let the AI draft questions from a topic. You review every one.</w:t>
+              <w:t xml:space="preserve">Multiple choice, true/false, short answer, fill in the blank and essay, with images, audio and subject tools, such as an equation toolbar for maths. Save questions in a bank and reuse them. Turn a PDF into questions, or let the AI draft questions from a topic. You review every one.</w:t>
             </w:r>
           </w:p>
         </w:tc>
@@ -2545,7 +2545,7 @@
                 <w:sz w:val="24"/>
                 <w:szCs w:val="24"/>
               </w:rPr>
-              <w:t xml:space="preserve">Your week at a glance</w:t>
+              <w:t xml:space="preserve">Current and future</w:t>
             </w:r>
           </w:p>
         </w:tc>
@@ -2573,7 +2573,7 @@
                 <w:sz w:val="24"/>
                 <w:szCs w:val="24"/>
               </w:rPr>
-              <w:t xml:space="preserve">A weekly summary of what is due, what needs attention and which students may need support. Teachers can also share resources with their department.</w:t>
+              <w:t xml:space="preserve">What is happening now and what is coming: what is due, what needs attention and which students may need support. Teachers can also share resources with their department.</w:t>
             </w:r>
           </w:p>
         </w:tc>

</xml_diff>